<commit_message>
Finalizando entrega unidade 3
</commit_message>
<xml_diff>
--- a/Análise inicial.docx
+++ b/Análise inicial.docx
@@ -7,12 +7,14 @@
         <w:rPr>
           <w:b/>
           <w:bCs/>
+          <w:lang w:val="en-US"/>
         </w:rPr>
       </w:pPr>
       <w:r>
         <w:rPr>
           <w:b/>
           <w:bCs/>
+          <w:lang w:val="en-US"/>
         </w:rPr>
         <w:t>1. Distribution</w:t>
       </w:r>
@@ -22,12 +24,14 @@
         <w:rPr>
           <w:b/>
           <w:bCs/>
+          <w:lang w:val="en-US"/>
         </w:rPr>
       </w:pPr>
       <w:r>
         <w:rPr>
           <w:b/>
           <w:bCs/>
+          <w:lang w:val="en-US"/>
         </w:rPr>
         <w:t>1.1) Description of the distribution</w:t>
       </w:r>
@@ -35,10 +39,14 @@
         <w:rPr>
           <w:b/>
           <w:bCs/>
+          <w:lang w:val="en-US"/>
         </w:rPr>
         <w:br/>
       </w:r>
       <w:r>
+        <w:rPr>
+          <w:lang w:val="en-US"/>
+        </w:rPr>
         <w:t>Based on the boxplot and the histogram (on a log10 scale):</w:t>
       </w:r>
     </w:p>
@@ -53,6 +61,7 @@
         <w:rPr>
           <w:b/>
           <w:bCs/>
+          <w:lang w:val="en-US"/>
         </w:rPr>
         <w:t>Skewness:</w:t>
       </w:r>
@@ -60,11 +69,61 @@
         <w:rPr>
           <w:b/>
           <w:bCs/>
+          <w:lang w:val="en-US"/>
         </w:rPr>
         <w:br/>
       </w:r>
       <w:r>
-        <w:t xml:space="preserve">The distribution in the original scale (values in dollars) is strongly right-skewed. This is evidenced by: </w:t>
+        <w:rPr>
+          <w:lang w:val="en-US"/>
+        </w:rPr>
+        <w:t xml:space="preserve">The distribution in the original scale (values in dollars) is strongly </w:t>
+      </w:r>
+      <w:proofErr w:type="gramStart"/>
+      <w:r>
+        <w:rPr>
+          <w:lang w:val="en-US"/>
+        </w:rPr>
+        <w:t>right-skewed</w:t>
+      </w:r>
+      <w:proofErr w:type="gramEnd"/>
+      <w:r>
+        <w:rPr>
+          <w:lang w:val="en-US"/>
+        </w:rPr>
+        <w:t xml:space="preserve">. </w:t>
+      </w:r>
+      <w:proofErr w:type="spellStart"/>
+      <w:r>
+        <w:t>This</w:t>
+      </w:r>
+      <w:proofErr w:type="spellEnd"/>
+      <w:r>
+        <w:t xml:space="preserve"> </w:t>
+      </w:r>
+      <w:proofErr w:type="spellStart"/>
+      <w:r>
+        <w:t>is</w:t>
+      </w:r>
+      <w:proofErr w:type="spellEnd"/>
+      <w:r>
+        <w:t xml:space="preserve"> </w:t>
+      </w:r>
+      <w:proofErr w:type="spellStart"/>
+      <w:r>
+        <w:t>evidenced</w:t>
+      </w:r>
+      <w:proofErr w:type="spellEnd"/>
+      <w:r>
+        <w:t xml:space="preserve"> </w:t>
+      </w:r>
+      <w:proofErr w:type="spellStart"/>
+      <w:r>
+        <w:t>by</w:t>
+      </w:r>
+      <w:proofErr w:type="spellEnd"/>
+      <w:r>
+        <w:t xml:space="preserve">: </w:t>
       </w:r>
     </w:p>
     <w:p>
@@ -73,8 +132,14 @@
           <w:ilvl w:val="1"/>
           <w:numId w:val="10"/>
         </w:numPr>
-      </w:pPr>
-      <w:r>
+        <w:rPr>
+          <w:lang w:val="en-US"/>
+        </w:rPr>
+      </w:pPr>
+      <w:r>
+        <w:rPr>
+          <w:lang w:val="en-US"/>
+        </w:rPr>
         <w:t xml:space="preserve">A long tail toward higher values </w:t>
       </w:r>
     </w:p>
@@ -84,8 +149,14 @@
           <w:ilvl w:val="1"/>
           <w:numId w:val="10"/>
         </w:numPr>
-      </w:pPr>
-      <w:r>
+        <w:rPr>
+          <w:lang w:val="en-US"/>
+        </w:rPr>
+      </w:pPr>
+      <w:r>
+        <w:rPr>
+          <w:lang w:val="en-US"/>
+        </w:rPr>
         <w:t xml:space="preserve">The median (~103k) being well below the third quartile (~570k) </w:t>
       </w:r>
     </w:p>
@@ -100,12 +171,80 @@
         <w:rPr>
           <w:b/>
           <w:bCs/>
+          <w:lang w:val="en-US"/>
         </w:rPr>
         <w:t>Outliers:</w:t>
       </w:r>
       <w:r>
+        <w:rPr>
+          <w:lang w:val="en-US"/>
+        </w:rPr>
         <w:br/>
-        <w:t xml:space="preserve">There are numerous upper outliers, reaching several orders of magnitude higher (up to ~210M). This indicates rare but extremely costly events (extreme disasters). </w:t>
+        <w:t xml:space="preserve">There are numerous upper outliers, reaching several orders of magnitude higher (up to ~210M). </w:t>
+      </w:r>
+      <w:proofErr w:type="spellStart"/>
+      <w:r>
+        <w:t>This</w:t>
+      </w:r>
+      <w:proofErr w:type="spellEnd"/>
+      <w:r>
+        <w:t xml:space="preserve"> </w:t>
+      </w:r>
+      <w:proofErr w:type="spellStart"/>
+      <w:r>
+        <w:t>indicates</w:t>
+      </w:r>
+      <w:proofErr w:type="spellEnd"/>
+      <w:r>
+        <w:t xml:space="preserve"> </w:t>
+      </w:r>
+      <w:proofErr w:type="spellStart"/>
+      <w:r>
+        <w:t>rare</w:t>
+      </w:r>
+      <w:proofErr w:type="spellEnd"/>
+      <w:r>
+        <w:t xml:space="preserve"> </w:t>
+      </w:r>
+      <w:proofErr w:type="spellStart"/>
+      <w:r>
+        <w:t>but</w:t>
+      </w:r>
+      <w:proofErr w:type="spellEnd"/>
+      <w:r>
+        <w:t xml:space="preserve"> </w:t>
+      </w:r>
+      <w:proofErr w:type="spellStart"/>
+      <w:r>
+        <w:t>extremely</w:t>
+      </w:r>
+      <w:proofErr w:type="spellEnd"/>
+      <w:r>
+        <w:t xml:space="preserve"> </w:t>
+      </w:r>
+      <w:proofErr w:type="spellStart"/>
+      <w:r>
+        <w:t>costly</w:t>
+      </w:r>
+      <w:proofErr w:type="spellEnd"/>
+      <w:r>
+        <w:t xml:space="preserve"> </w:t>
+      </w:r>
+      <w:proofErr w:type="spellStart"/>
+      <w:r>
+        <w:t>events</w:t>
+      </w:r>
+      <w:proofErr w:type="spellEnd"/>
+      <w:r>
+        <w:t xml:space="preserve"> (extreme </w:t>
+      </w:r>
+      <w:proofErr w:type="spellStart"/>
+      <w:r>
+        <w:t>disasters</w:t>
+      </w:r>
+      <w:proofErr w:type="spellEnd"/>
+      <w:r>
+        <w:t xml:space="preserve">). </w:t>
       </w:r>
     </w:p>
     <w:p>
@@ -117,16 +256,21 @@
         <w:rPr>
           <w:b/>
           <w:bCs/>
+          <w:lang w:val="en-US"/>
         </w:rPr>
       </w:pPr>
       <w:r>
         <w:rPr>
           <w:b/>
           <w:bCs/>
+          <w:lang w:val="en-US"/>
         </w:rPr>
         <w:t>Dispersion:</w:t>
       </w:r>
       <w:r>
+        <w:rPr>
+          <w:lang w:val="en-US"/>
+        </w:rPr>
         <w:br/>
         <w:t>High variability (wide interquartile range and long whiskers).</w:t>
       </w:r>
@@ -134,6 +278,7 @@
         <w:rPr>
           <w:b/>
           <w:bCs/>
+          <w:lang w:val="en-US"/>
         </w:rPr>
         <w:t xml:space="preserve"> </w:t>
       </w:r>
@@ -144,15 +289,22 @@
           <w:ilvl w:val="0"/>
           <w:numId w:val="10"/>
         </w:numPr>
+        <w:rPr>
+          <w:lang w:val="en-US"/>
+        </w:rPr>
       </w:pPr>
       <w:r>
         <w:rPr>
           <w:b/>
           <w:bCs/>
+          <w:lang w:val="en-US"/>
         </w:rPr>
         <w:t>Logarithmic transformation:</w:t>
       </w:r>
       <w:r>
+        <w:rPr>
+          <w:lang w:val="en-US"/>
+        </w:rPr>
         <w:br/>
         <w:t xml:space="preserve">In the log10 histogram, the distribution becomes: </w:t>
       </w:r>
@@ -164,8 +316,21 @@
           <w:numId w:val="10"/>
         </w:numPr>
       </w:pPr>
-      <w:r>
-        <w:t xml:space="preserve">Approximately more symmetric </w:t>
+      <w:proofErr w:type="spellStart"/>
+      <w:r>
+        <w:t>Approximately</w:t>
+      </w:r>
+      <w:proofErr w:type="spellEnd"/>
+      <w:r>
+        <w:t xml:space="preserve"> more </w:t>
+      </w:r>
+      <w:proofErr w:type="spellStart"/>
+      <w:r>
+        <w:t>symmetric</w:t>
+      </w:r>
+      <w:proofErr w:type="spellEnd"/>
+      <w:r>
+        <w:t xml:space="preserve"> </w:t>
       </w:r>
     </w:p>
     <w:p>
@@ -174,11 +339,20 @@
           <w:ilvl w:val="1"/>
           <w:numId w:val="10"/>
         </w:numPr>
-      </w:pPr>
-      <w:r>
+        <w:rPr>
+          <w:lang w:val="en-US"/>
+        </w:rPr>
+      </w:pPr>
+      <w:r>
+        <w:rPr>
+          <w:lang w:val="en-US"/>
+        </w:rPr>
         <w:t>Nearly unimodal</w:t>
       </w:r>
       <w:r>
+        <w:rPr>
+          <w:lang w:val="en-US"/>
+        </w:rPr>
         <w:br/>
         <w:t xml:space="preserve">This suggests the data follow a typical multiplicative structure. </w:t>
       </w:r>
@@ -188,6 +362,7 @@
         <w:rPr>
           <w:b/>
           <w:bCs/>
+          <w:lang w:val="en-US"/>
         </w:rPr>
       </w:pPr>
     </w:p>
@@ -197,8 +372,33 @@
           <w:b/>
           <w:bCs/>
         </w:rPr>
-        <w:t>1.2) Statistical hypothesis</w:t>
-      </w:r>
+        <w:t xml:space="preserve">1.2) </w:t>
+      </w:r>
+      <w:proofErr w:type="spellStart"/>
+      <w:r>
+        <w:rPr>
+          <w:b/>
+          <w:bCs/>
+        </w:rPr>
+        <w:t>Statistical</w:t>
+      </w:r>
+      <w:proofErr w:type="spellEnd"/>
+      <w:r>
+        <w:rPr>
+          <w:b/>
+          <w:bCs/>
+        </w:rPr>
+        <w:t xml:space="preserve"> </w:t>
+      </w:r>
+      <w:proofErr w:type="spellStart"/>
+      <w:r>
+        <w:rPr>
+          <w:b/>
+          <w:bCs/>
+        </w:rPr>
+        <w:t>hypothesis</w:t>
+      </w:r>
+      <w:proofErr w:type="spellEnd"/>
     </w:p>
     <w:p>
       <w:pPr>
@@ -206,17 +406,22 @@
           <w:ilvl w:val="0"/>
           <w:numId w:val="11"/>
         </w:numPr>
-      </w:pPr>
-      <w:r>
+        <w:rPr>
+          <w:lang w:val="en-US"/>
+        </w:rPr>
+      </w:pPr>
+      <w:r>
+        <w:rPr>
+          <w:lang w:val="en-US"/>
+        </w:rPr>
         <w:t>H₀ (null hypothesis):</w:t>
       </w:r>
       <w:r>
+        <w:rPr>
+          <w:lang w:val="en-US"/>
+        </w:rPr>
         <w:br/>
-        <w:t>The logarithm of Total Damage follows a normal distribution</w:t>
-      </w:r>
-      <w:r>
-        <w:br/>
-        <w:t xml:space="preserve">(equivalently, Total Damage follows a log-normal distribution) </w:t>
+        <w:t xml:space="preserve">The logarithm of Total Damage follows a normal distribution </w:t>
       </w:r>
     </w:p>
     <w:p>
@@ -225,46 +430,123 @@
           <w:ilvl w:val="0"/>
           <w:numId w:val="11"/>
         </w:numPr>
-      </w:pPr>
-      <w:r>
+        <w:rPr>
+          <w:lang w:val="en-US"/>
+        </w:rPr>
+      </w:pPr>
+      <w:r>
+        <w:rPr>
+          <w:lang w:val="en-US"/>
+        </w:rPr>
         <w:t>H₁ (alternative hypothesis):</w:t>
       </w:r>
       <w:r>
+        <w:rPr>
+          <w:lang w:val="en-US"/>
+        </w:rPr>
         <w:br/>
         <w:t>The logarithm of Total Damage does not follow a normal distribution</w:t>
       </w:r>
     </w:p>
-    <w:p/>
-    <w:p/>
-    <w:p/>
-    <w:p/>
-    <w:p/>
-    <w:p/>
-    <w:p/>
-    <w:p/>
-    <w:p/>
-    <w:p/>
+    <w:p>
+      <w:pPr>
+        <w:rPr>
+          <w:lang w:val="en-US"/>
+        </w:rPr>
+      </w:pPr>
+    </w:p>
     <w:p>
       <w:pPr>
         <w:rPr>
           <w:b/>
           <w:bCs/>
-        </w:rPr>
-      </w:pPr>
-      <w:r>
+          <w:lang w:val="en-US"/>
+        </w:rPr>
+      </w:pPr>
+    </w:p>
+    <w:p>
+      <w:pPr>
+        <w:rPr>
+          <w:lang w:val="en-US"/>
+        </w:rPr>
+      </w:pPr>
+    </w:p>
+    <w:p>
+      <w:pPr>
+        <w:rPr>
+          <w:lang w:val="en-US"/>
+        </w:rPr>
+      </w:pPr>
+    </w:p>
+    <w:p>
+      <w:pPr>
+        <w:rPr>
+          <w:lang w:val="en-US"/>
+        </w:rPr>
+      </w:pPr>
+    </w:p>
+    <w:p>
+      <w:pPr>
+        <w:rPr>
+          <w:lang w:val="en-US"/>
+        </w:rPr>
+      </w:pPr>
+    </w:p>
+    <w:p>
+      <w:pPr>
+        <w:rPr>
+          <w:lang w:val="en-US"/>
+        </w:rPr>
+      </w:pPr>
+    </w:p>
+    <w:p>
+      <w:pPr>
+        <w:rPr>
+          <w:lang w:val="en-US"/>
+        </w:rPr>
+      </w:pPr>
+    </w:p>
+    <w:p>
+      <w:pPr>
+        <w:rPr>
+          <w:lang w:val="en-US"/>
+        </w:rPr>
+      </w:pPr>
+    </w:p>
+    <w:p>
+      <w:pPr>
+        <w:rPr>
+          <w:lang w:val="en-US"/>
+        </w:rPr>
+      </w:pPr>
+    </w:p>
+    <w:p>
+      <w:pPr>
+        <w:rPr>
+          <w:lang w:val="en-US"/>
+        </w:rPr>
+      </w:pPr>
+    </w:p>
+    <w:p>
+      <w:pPr>
+        <w:rPr>
+          <w:lang w:val="en-US"/>
+        </w:rPr>
+      </w:pPr>
+    </w:p>
+    <w:p>
+      <w:pPr>
         <w:rPr>
           <w:b/>
           <w:bCs/>
         </w:rPr>
-        <w:lastRenderedPageBreak/>
-        <w:t xml:space="preserve">1 </w:t>
-      </w:r>
+      </w:pPr>
       <w:r>
         <w:rPr>
           <w:b/>
           <w:bCs/>
         </w:rPr>
-        <w:t>Correlação</w:t>
+        <w:t>1 Correlação</w:t>
       </w:r>
     </w:p>
     <w:p>
@@ -286,8 +568,33 @@
           <w:b/>
           <w:bCs/>
         </w:rPr>
-        <w:t>) Observed relationship</w:t>
-      </w:r>
+        <w:t xml:space="preserve">) </w:t>
+      </w:r>
+      <w:proofErr w:type="spellStart"/>
+      <w:r>
+        <w:rPr>
+          <w:b/>
+          <w:bCs/>
+        </w:rPr>
+        <w:t>Observed</w:t>
+      </w:r>
+      <w:proofErr w:type="spellEnd"/>
+      <w:r>
+        <w:rPr>
+          <w:b/>
+          <w:bCs/>
+        </w:rPr>
+        <w:t xml:space="preserve"> </w:t>
+      </w:r>
+      <w:proofErr w:type="spellStart"/>
+      <w:r>
+        <w:rPr>
+          <w:b/>
+          <w:bCs/>
+        </w:rPr>
+        <w:t>relationship</w:t>
+      </w:r>
+      <w:proofErr w:type="spellEnd"/>
     </w:p>
     <w:p>
       <w:pPr>
@@ -300,10 +607,14 @@
         <w:rPr>
           <w:b/>
           <w:bCs/>
+          <w:lang w:val="en-US"/>
         </w:rPr>
         <w:t>Overall dataset:</w:t>
       </w:r>
       <w:r>
+        <w:rPr>
+          <w:lang w:val="en-US"/>
+        </w:rPr>
         <w:br/>
         <w:t xml:space="preserve">The correlation between </w:t>
       </w:r>
@@ -311,21 +622,93 @@
         <w:rPr>
           <w:i/>
           <w:iCs/>
+          <w:lang w:val="en-US"/>
         </w:rPr>
         <w:t>Total Impacted</w:t>
       </w:r>
       <w:r>
+        <w:rPr>
+          <w:lang w:val="en-US"/>
+        </w:rPr>
         <w:t xml:space="preserve"> and </w:t>
       </w:r>
       <w:r>
         <w:rPr>
           <w:i/>
           <w:iCs/>
+          <w:lang w:val="en-US"/>
         </w:rPr>
         <w:t>Total Damage</w:t>
       </w:r>
       <w:r>
-        <w:t xml:space="preserve"> is weak or near zero, indicating no clear global linear relationship. This suggests substantial heterogeneity across countries and disaster types. </w:t>
+        <w:rPr>
+          <w:lang w:val="en-US"/>
+        </w:rPr>
+        <w:t xml:space="preserve"> is weak or near zero, indicating no clear global linear relationship. </w:t>
+      </w:r>
+      <w:proofErr w:type="spellStart"/>
+      <w:r>
+        <w:t>This</w:t>
+      </w:r>
+      <w:proofErr w:type="spellEnd"/>
+      <w:r>
+        <w:t xml:space="preserve"> </w:t>
+      </w:r>
+      <w:proofErr w:type="spellStart"/>
+      <w:r>
+        <w:t>suggests</w:t>
+      </w:r>
+      <w:proofErr w:type="spellEnd"/>
+      <w:r>
+        <w:t xml:space="preserve"> </w:t>
+      </w:r>
+      <w:proofErr w:type="spellStart"/>
+      <w:r>
+        <w:t>substantial</w:t>
+      </w:r>
+      <w:proofErr w:type="spellEnd"/>
+      <w:r>
+        <w:t xml:space="preserve"> </w:t>
+      </w:r>
+      <w:proofErr w:type="spellStart"/>
+      <w:r>
+        <w:t>heterogeneity</w:t>
+      </w:r>
+      <w:proofErr w:type="spellEnd"/>
+      <w:r>
+        <w:t xml:space="preserve"> </w:t>
+      </w:r>
+      <w:proofErr w:type="spellStart"/>
+      <w:r>
+        <w:t>across</w:t>
+      </w:r>
+      <w:proofErr w:type="spellEnd"/>
+      <w:r>
+        <w:t xml:space="preserve"> countries </w:t>
+      </w:r>
+      <w:proofErr w:type="spellStart"/>
+      <w:r>
+        <w:t>and</w:t>
+      </w:r>
+      <w:proofErr w:type="spellEnd"/>
+      <w:r>
+        <w:t xml:space="preserve"> </w:t>
+      </w:r>
+      <w:proofErr w:type="spellStart"/>
+      <w:r>
+        <w:t>disaster</w:t>
+      </w:r>
+      <w:proofErr w:type="spellEnd"/>
+      <w:r>
+        <w:t xml:space="preserve"> </w:t>
+      </w:r>
+      <w:proofErr w:type="spellStart"/>
+      <w:r>
+        <w:t>types</w:t>
+      </w:r>
+      <w:proofErr w:type="spellEnd"/>
+      <w:r>
+        <w:t xml:space="preserve">. </w:t>
       </w:r>
     </w:p>
     <w:p>
@@ -334,15 +717,22 @@
           <w:ilvl w:val="0"/>
           <w:numId w:val="6"/>
         </w:numPr>
+        <w:rPr>
+          <w:lang w:val="en-US"/>
+        </w:rPr>
       </w:pPr>
       <w:r>
         <w:rPr>
           <w:b/>
           <w:bCs/>
+          <w:lang w:val="en-US"/>
         </w:rPr>
         <w:t>Filtered subset (Japan, Earthquakes):</w:t>
       </w:r>
       <w:r>
+        <w:rPr>
+          <w:lang w:val="en-US"/>
+        </w:rPr>
         <w:br/>
         <w:t xml:space="preserve">The relationship becomes strongly positive (≈ 0.80 correlation): </w:t>
       </w:r>
@@ -353,8 +743,14 @@
           <w:ilvl w:val="1"/>
           <w:numId w:val="6"/>
         </w:numPr>
-      </w:pPr>
-      <w:r>
+        <w:rPr>
+          <w:lang w:val="en-US"/>
+        </w:rPr>
+      </w:pPr>
+      <w:r>
+        <w:rPr>
+          <w:lang w:val="en-US"/>
+        </w:rPr>
         <w:t xml:space="preserve">As the number of impacted individuals increases, total economic damage also increases. </w:t>
       </w:r>
     </w:p>
@@ -364,23 +760,51 @@
           <w:ilvl w:val="1"/>
           <w:numId w:val="6"/>
         </w:numPr>
-      </w:pPr>
-      <w:r>
-        <w:t xml:space="preserve">The pattern is consistent with a positive monotonic association, likely reflecting more homogeneous infrastructure, reporting standards, and disaster characteristics. </w:t>
-      </w:r>
-    </w:p>
-    <w:p/>
+        <w:rPr>
+          <w:lang w:val="en-US"/>
+        </w:rPr>
+      </w:pPr>
+      <w:r>
+        <w:rPr>
+          <w:lang w:val="en-US"/>
+        </w:rPr>
+        <w:t>The pattern is consistent with a positive monotonic association</w:t>
+      </w:r>
+      <w:proofErr w:type="gramStart"/>
+      <w:r>
+        <w:rPr>
+          <w:lang w:val="en-US"/>
+        </w:rPr>
+        <w:t>, likely</w:t>
+      </w:r>
+      <w:proofErr w:type="gramEnd"/>
+      <w:r>
+        <w:rPr>
+          <w:lang w:val="en-US"/>
+        </w:rPr>
+        <w:t xml:space="preserve"> reflecting more homogeneous infrastructure, reporting standards, and disaster characteristics. </w:t>
+      </w:r>
+    </w:p>
+    <w:p>
+      <w:pPr>
+        <w:rPr>
+          <w:lang w:val="en-US"/>
+        </w:rPr>
+      </w:pPr>
+    </w:p>
     <w:p>
       <w:pPr>
         <w:rPr>
           <w:b/>
           <w:bCs/>
+          <w:lang w:val="en-US"/>
         </w:rPr>
       </w:pPr>
       <w:r>
         <w:rPr>
           <w:b/>
           <w:bCs/>
+          <w:lang w:val="en-US"/>
         </w:rPr>
         <w:t>2</w:t>
       </w:r>
@@ -388,6 +812,7 @@
         <w:rPr>
           <w:b/>
           <w:bCs/>
+          <w:lang w:val="en-US"/>
         </w:rPr>
         <w:t>.2</w:t>
       </w:r>
@@ -395,12 +820,21 @@
         <w:rPr>
           <w:b/>
           <w:bCs/>
+          <w:lang w:val="en-US"/>
         </w:rPr>
         <w:t>) Interpretation</w:t>
       </w:r>
     </w:p>
     <w:p>
-      <w:r>
+      <w:pPr>
+        <w:rPr>
+          <w:lang w:val="en-US"/>
+        </w:rPr>
+      </w:pPr>
+      <w:r>
+        <w:rPr>
+          <w:lang w:val="en-US"/>
+        </w:rPr>
         <w:t>The contrast indicates that:</w:t>
       </w:r>
     </w:p>
@@ -410,15 +844,23 @@
           <w:ilvl w:val="0"/>
           <w:numId w:val="7"/>
         </w:numPr>
-      </w:pPr>
-      <w:r>
-        <w:t>The global aggregation masks conditional relationships</w:t>
-      </w:r>
-      <w:r>
-        <w:t>.</w:t>
-      </w:r>
-      <w:r>
-        <w:t xml:space="preserve"> </w:t>
+        <w:rPr>
+          <w:lang w:val="en-US"/>
+        </w:rPr>
+      </w:pPr>
+      <w:proofErr w:type="gramStart"/>
+      <w:r>
+        <w:rPr>
+          <w:lang w:val="en-US"/>
+        </w:rPr>
+        <w:t>The global</w:t>
+      </w:r>
+      <w:proofErr w:type="gramEnd"/>
+      <w:r>
+        <w:rPr>
+          <w:lang w:val="en-US"/>
+        </w:rPr>
+        <w:t xml:space="preserve"> aggregation masks conditional relationships. </w:t>
       </w:r>
     </w:p>
     <w:p>
@@ -427,17 +869,35 @@
           <w:ilvl w:val="0"/>
           <w:numId w:val="7"/>
         </w:numPr>
-      </w:pPr>
-      <w:r>
+        <w:rPr>
+          <w:lang w:val="en-US"/>
+        </w:rPr>
+      </w:pPr>
+      <w:r>
+        <w:rPr>
+          <w:lang w:val="en-US"/>
+        </w:rPr>
         <w:t xml:space="preserve">Within more homogeneous subsets (same country and disaster type), the relationship becomes structurally clearer and statistically stronger. </w:t>
       </w:r>
     </w:p>
-    <w:p/>
-    <w:p>
+    <w:p>
+      <w:pPr>
+        <w:rPr>
+          <w:lang w:val="en-US"/>
+        </w:rPr>
+      </w:pPr>
+    </w:p>
+    <w:p>
+      <w:pPr>
+        <w:rPr>
+          <w:lang w:val="en-US"/>
+        </w:rPr>
+      </w:pPr>
       <w:r>
         <w:rPr>
           <w:b/>
           <w:bCs/>
+          <w:lang w:val="en-US"/>
         </w:rPr>
         <w:t>2.</w:t>
       </w:r>
@@ -445,6 +905,7 @@
         <w:rPr>
           <w:b/>
           <w:bCs/>
+          <w:lang w:val="en-US"/>
         </w:rPr>
         <w:t>3) Hypotheses</w:t>
       </w:r>
@@ -454,12 +915,14 @@
         <w:rPr>
           <w:b/>
           <w:bCs/>
+          <w:lang w:val="en-US"/>
         </w:rPr>
       </w:pPr>
       <w:r>
         <w:rPr>
           <w:b/>
           <w:bCs/>
+          <w:lang w:val="en-US"/>
         </w:rPr>
         <w:t>A) Global relationship (full dataset)</w:t>
       </w:r>
@@ -470,28 +933,42 @@
           <w:ilvl w:val="0"/>
           <w:numId w:val="8"/>
         </w:numPr>
-      </w:pPr>
-      <w:r>
+        <w:rPr>
+          <w:lang w:val="en-US"/>
+        </w:rPr>
+      </w:pPr>
+      <w:r>
+        <w:rPr>
+          <w:lang w:val="en-US"/>
+        </w:rPr>
         <w:t xml:space="preserve">H₀: There is no association between </w:t>
       </w:r>
       <w:r>
         <w:rPr>
           <w:i/>
           <w:iCs/>
+          <w:lang w:val="en-US"/>
         </w:rPr>
         <w:t>Total Impacted</w:t>
       </w:r>
       <w:r>
+        <w:rPr>
+          <w:lang w:val="en-US"/>
+        </w:rPr>
         <w:t xml:space="preserve"> and </w:t>
       </w:r>
       <w:r>
         <w:rPr>
           <w:i/>
           <w:iCs/>
+          <w:lang w:val="en-US"/>
         </w:rPr>
         <w:t>Total Damage</w:t>
       </w:r>
       <w:r>
+        <w:rPr>
+          <w:lang w:val="en-US"/>
+        </w:rPr>
         <w:t xml:space="preserve">. </w:t>
       </w:r>
     </w:p>
@@ -500,12 +977,14 @@
         <w:rPr>
           <w:b/>
           <w:bCs/>
+          <w:lang w:val="en-US"/>
         </w:rPr>
       </w:pPr>
       <w:r>
         <w:rPr>
           <w:b/>
           <w:bCs/>
+          <w:lang w:val="en-US"/>
         </w:rPr>
         <w:t>B) Conditional relationship (Japan, Earthquakes)</w:t>
       </w:r>
@@ -516,37 +995,87 @@
           <w:ilvl w:val="0"/>
           <w:numId w:val="9"/>
         </w:numPr>
-      </w:pPr>
-      <w:r>
+        <w:rPr>
+          <w:lang w:val="en-US"/>
+        </w:rPr>
+      </w:pPr>
+      <w:r>
+        <w:rPr>
+          <w:lang w:val="en-US"/>
+        </w:rPr>
         <w:t xml:space="preserve">H₁: There is a positive association between </w:t>
       </w:r>
       <w:r>
         <w:rPr>
           <w:i/>
           <w:iCs/>
+          <w:lang w:val="en-US"/>
         </w:rPr>
         <w:t>Total Impacted</w:t>
       </w:r>
       <w:r>
+        <w:rPr>
+          <w:lang w:val="en-US"/>
+        </w:rPr>
         <w:t xml:space="preserve"> and </w:t>
       </w:r>
       <w:r>
         <w:rPr>
           <w:i/>
           <w:iCs/>
+          <w:lang w:val="en-US"/>
         </w:rPr>
         <w:t>Total Damage</w:t>
       </w:r>
       <w:r>
+        <w:rPr>
+          <w:lang w:val="en-US"/>
+        </w:rPr>
         <w:t xml:space="preserve"> for earthquakes in Japan. </w:t>
       </w:r>
     </w:p>
-    <w:p/>
-    <w:p/>
-    <w:p/>
-    <w:p/>
-    <w:p/>
-    <w:p/>
+    <w:p>
+      <w:pPr>
+        <w:rPr>
+          <w:lang w:val="en-US"/>
+        </w:rPr>
+      </w:pPr>
+    </w:p>
+    <w:p>
+      <w:pPr>
+        <w:rPr>
+          <w:lang w:val="en-US"/>
+        </w:rPr>
+      </w:pPr>
+    </w:p>
+    <w:p>
+      <w:pPr>
+        <w:rPr>
+          <w:lang w:val="en-US"/>
+        </w:rPr>
+      </w:pPr>
+    </w:p>
+    <w:p>
+      <w:pPr>
+        <w:rPr>
+          <w:lang w:val="en-US"/>
+        </w:rPr>
+      </w:pPr>
+    </w:p>
+    <w:p>
+      <w:pPr>
+        <w:rPr>
+          <w:lang w:val="en-US"/>
+        </w:rPr>
+      </w:pPr>
+    </w:p>
+    <w:p>
+      <w:pPr>
+        <w:rPr>
+          <w:lang w:val="en-US"/>
+        </w:rPr>
+      </w:pPr>
+    </w:p>
     <w:sectPr>
       <w:pgSz w:w="11906" w:h="16838"/>
       <w:pgMar w:top="1417" w:right="1701" w:bottom="1417" w:left="1701" w:header="708" w:footer="708" w:gutter="0"/>
@@ -2838,6 +3367,7 @@
   <w:style w:type="character" w:default="1" w:styleId="Fontepargpadro">
     <w:name w:val="Default Paragraph Font"/>
     <w:uiPriority w:val="1"/>
+    <w:semiHidden/>
     <w:unhideWhenUsed/>
   </w:style>
   <w:style w:type="table" w:default="1" w:styleId="Tabelanormal">

</xml_diff>